<commit_message>
Update Canvas Platformer Reflections.docx
</commit_message>
<xml_diff>
--- a/docpac_041109/Canvas Platformer/Canvas Platformer Reflections.docx
+++ b/docpac_041109/Canvas Platformer/Canvas Platformer Reflections.docx
@@ -1,6 +1,6 @@
 
 <file path=word/document.xml><?xml version="1.0" encoding="utf-8"?>
-<w:document xmlns:wpc="http://schemas.microsoft.com/office/word/2010/wordprocessingCanvas" xmlns:cx="http://schemas.microsoft.com/office/drawing/2014/chartex" xmlns:cx1="http://schemas.microsoft.com/office/drawing/2015/9/8/chartex" xmlns:cx2="http://schemas.microsoft.com/office/drawing/2015/10/21/chartex" xmlns:cx3="http://schemas.microsoft.com/office/drawing/2016/5/9/chartex" xmlns:cx4="http://schemas.microsoft.com/office/drawing/2016/5/10/chartex" xmlns:cx5="http://schemas.microsoft.com/office/drawing/2016/5/11/chartex" xmlns:cx6="http://schemas.microsoft.com/office/drawing/2016/5/12/chartex" xmlns:cx7="http://schemas.microsoft.com/office/drawing/2016/5/13/chartex" xmlns:cx8="http://schemas.microsoft.com/office/drawing/2016/5/14/chartex" xmlns:mc="http://schemas.openxmlformats.org/markup-compatibility/2006" xmlns:aink="http://schemas.microsoft.com/office/drawing/2016/ink" xmlns:am3d="http://schemas.microsoft.com/office/drawing/2017/model3d" xmlns:o="urn:schemas-microsoft-com:office:office" xmlns:r="http://schemas.openxmlformats.org/officeDocument/2006/relationships" xmlns:m="http://schemas.openxmlformats.org/officeDocument/2006/math" xmlns:v="urn:schemas-microsoft-com:vml" xmlns:wp14="http://schemas.microsoft.com/office/word/2010/wordprocessingDrawing" xmlns:wp="http://schemas.openxmlformats.org/drawingml/2006/wordprocessingDrawing" xmlns:w10="urn:schemas-microsoft-com:office:word" xmlns:w="http://schemas.openxmlformats.org/wordprocessingml/2006/main" xmlns:w14="http://schemas.microsoft.com/office/word/2010/wordml" xmlns:w15="http://schemas.microsoft.com/office/word/2012/wordml" xmlns:w16cex="http://schemas.microsoft.com/office/word/2018/wordml/cex" xmlns:w16cid="http://schemas.microsoft.com/office/word/2016/wordml/cid" xmlns:w16="http://schemas.microsoft.com/office/word/2018/wordml" xmlns:w16sdtdh="http://schemas.microsoft.com/office/word/2020/wordml/sdtdatahash" xmlns:w16se="http://schemas.microsoft.com/office/word/2015/wordml/symex" xmlns:wpg="http://schemas.microsoft.com/office/word/2010/wordprocessingGroup" xmlns:wpi="http://schemas.microsoft.com/office/word/2010/wordprocessingInk" xmlns:wne="http://schemas.microsoft.com/office/word/2006/wordml" xmlns:wps="http://schemas.microsoft.com/office/word/2010/wordprocessingShape" mc:Ignorable="w14 w15 w16se w16cid w16 w16cex w16sdtdh wp14">
+<w:document xmlns:wpc="http://schemas.microsoft.com/office/word/2010/wordprocessingCanvas" xmlns:cx="http://schemas.microsoft.com/office/drawing/2014/chartex" xmlns:cx1="http://schemas.microsoft.com/office/drawing/2015/9/8/chartex" xmlns:cx2="http://schemas.microsoft.com/office/drawing/2015/10/21/chartex" xmlns:cx3="http://schemas.microsoft.com/office/drawing/2016/5/9/chartex" xmlns:cx4="http://schemas.microsoft.com/office/drawing/2016/5/10/chartex" xmlns:cx5="http://schemas.microsoft.com/office/drawing/2016/5/11/chartex" xmlns:cx6="http://schemas.microsoft.com/office/drawing/2016/5/12/chartex" xmlns:cx7="http://schemas.microsoft.com/office/drawing/2016/5/13/chartex" xmlns:cx8="http://schemas.microsoft.com/office/drawing/2016/5/14/chartex" xmlns:mc="http://schemas.openxmlformats.org/markup-compatibility/2006" xmlns:aink="http://schemas.microsoft.com/office/drawing/2016/ink" xmlns:am3d="http://schemas.microsoft.com/office/drawing/2017/model3d" xmlns:o="urn:schemas-microsoft-com:office:office" xmlns:r="http://schemas.openxmlformats.org/officeDocument/2006/relationships" xmlns:m="http://schemas.openxmlformats.org/officeDocument/2006/math" xmlns:v="urn:schemas-microsoft-com:vml" xmlns:wp14="http://schemas.microsoft.com/office/word/2010/wordprocessingDrawing" xmlns:wp="http://schemas.openxmlformats.org/drawingml/2006/wordprocessingDrawing" xmlns:w10="urn:schemas-microsoft-com:office:word" xmlns:w="http://schemas.openxmlformats.org/wordprocessingml/2006/main" xmlns:w14="http://schemas.microsoft.com/office/word/2010/wordml" xmlns:w15="http://schemas.microsoft.com/office/word/2012/wordml" xmlns:w16cid="http://schemas.microsoft.com/office/word/2016/wordml/cid" xmlns:w16se="http://schemas.microsoft.com/office/word/2015/wordml/symex" xmlns:wpg="http://schemas.microsoft.com/office/word/2010/wordprocessingGroup" xmlns:wpi="http://schemas.microsoft.com/office/word/2010/wordprocessingInk" xmlns:wne="http://schemas.microsoft.com/office/word/2006/wordml" xmlns:wps="http://schemas.microsoft.com/office/word/2010/wordprocessingShape" mc:Ignorable="w14 w15 w16se w16cid wp14">
   <w:body>
     <w:p>
       <w:pPr>
@@ -15,8 +15,6 @@
     <w:p>
       <w:pPr>
         <w:pStyle w:val="Heading1"/>
-        <w:keepNext/>
-        <w:keepLines/>
       </w:pPr>
       <w:r>
         <w:t>Step Reflections</w:t>
@@ -35,7 +33,21 @@
         <w:rPr>
           <w:b/>
         </w:rPr>
-        <w:t>What does successfully drawing one rectangle prove about the project’s HTML and JavaScript setup?</w:t>
+        <w:t xml:space="preserve">What does successfully </w:t>
+      </w:r>
+      <w:proofErr w:type="gramStart"/>
+      <w:r>
+        <w:rPr>
+          <w:b/>
+        </w:rPr>
+        <w:t>drawing</w:t>
+      </w:r>
+      <w:proofErr w:type="gramEnd"/>
+      <w:r>
+        <w:rPr>
+          <w:b/>
+        </w:rPr>
+        <w:t xml:space="preserve"> one rectangle prove about the connection between the HTML page and JavaScript?</w:t>
       </w:r>
     </w:p>
     <w:tbl>
@@ -263,7 +275,6 @@
           </w:tcPr>
           <w:p>
             <w:pPr>
-              <w:keepNext w:val="0"/>
               <w:keepLines/>
               <w:spacing w:after="0"/>
               <w:rPr>
@@ -288,7 +299,29 @@
         <w:rPr>
           <w:b/>
         </w:rPr>
-        <w:t>Which shared properties allow the floor, walls, and platforms to use the same class?</w:t>
+        <w:t xml:space="preserve">Why should the player's position be stored in variables or object properties instead of being written directly into </w:t>
+      </w:r>
+      <w:proofErr w:type="spellStart"/>
+      <w:proofErr w:type="gramStart"/>
+      <w:r>
+        <w:rPr>
+          <w:b/>
+        </w:rPr>
+        <w:t>fillRect</w:t>
+      </w:r>
+      <w:proofErr w:type="spellEnd"/>
+      <w:r>
+        <w:rPr>
+          <w:b/>
+        </w:rPr>
+        <w:t>(</w:t>
+      </w:r>
+      <w:proofErr w:type="gramEnd"/>
+      <w:r>
+        <w:rPr>
+          <w:b/>
+        </w:rPr>
+        <w:t>)?</w:t>
       </w:r>
     </w:p>
     <w:tbl>
@@ -516,7 +549,6 @@
           </w:tcPr>
           <w:p>
             <w:pPr>
-              <w:keepNext w:val="0"/>
               <w:keepLines/>
               <w:spacing w:after="0"/>
               <w:rPr>
@@ -541,7 +573,7 @@
         <w:rPr>
           <w:b/>
         </w:rPr>
-        <w:t>Which Player properties are inherited, and which properties must be added specifically for movement and jumping?</w:t>
+        <w:t>Why must the canvas be cleared and redrawn during each animation frame?</w:t>
       </w:r>
     </w:p>
     <w:tbl>
@@ -769,7 +801,6 @@
           </w:tcPr>
           <w:p>
             <w:pPr>
-              <w:keepNext w:val="0"/>
               <w:keepLines/>
               <w:spacing w:after="0"/>
               <w:rPr>
@@ -794,7 +825,7 @@
         <w:rPr>
           <w:b/>
         </w:rPr>
-        <w:t>Why should object creation occur in setup() instead of inside the repeating game loop?</w:t>
+        <w:t>Why must a game track whether input is currently active instead of responding only once when a key or joystick first moves?</w:t>
       </w:r>
     </w:p>
     <w:tbl>
@@ -1022,7 +1053,6 @@
           </w:tcPr>
           <w:p>
             <w:pPr>
-              <w:keepNext w:val="0"/>
               <w:keepLines/>
               <w:spacing w:after="0"/>
               <w:rPr>
@@ -1047,7 +1077,7 @@
         <w:rPr>
           <w:b/>
         </w:rPr>
-        <w:t>Why is the controller’s saved index more reliable than always reading the first item in the gamepad array?</w:t>
+        <w:t>Why does moving upward decrease y while moving downward increases y on an HTML canvas?</w:t>
       </w:r>
     </w:p>
     <w:tbl>
@@ -1275,7 +1305,6 @@
           </w:tcPr>
           <w:p>
             <w:pPr>
-              <w:keepNext w:val="0"/>
               <w:keepLines/>
               <w:spacing w:after="0"/>
               <w:rPr>
@@ -1300,7 +1329,8 @@
         <w:rPr>
           <w:b/>
         </w:rPr>
-        <w:t>Why does multiplying the joystick value by speed allow both slow and full-speed movement?</w:t>
+        <w:lastRenderedPageBreak/>
+        <w:t>Why do the right and bottom boundary checks need the player's width and height while the left and top checks do not?</w:t>
       </w:r>
     </w:p>
     <w:tbl>
@@ -1528,7 +1558,6 @@
           </w:tcPr>
           <w:p>
             <w:pPr>
-              <w:keepNext w:val="0"/>
               <w:keepLines/>
               <w:spacing w:after="0"/>
               <w:rPr>
@@ -1553,7 +1582,7 @@
         <w:rPr>
           <w:b/>
         </w:rPr>
-        <w:t>Why should gravity change vertical velocity rather than moving the Player downward by one fixed amount?</w:t>
+        <w:t>Which single boundary test is most likely to reveal a mistake in how the player's size is used, and why?</w:t>
       </w:r>
     </w:p>
     <w:tbl>
@@ -1781,7 +1810,6 @@
           </w:tcPr>
           <w:p>
             <w:pPr>
-              <w:keepNext w:val="0"/>
               <w:keepLines/>
               <w:spacing w:after="0"/>
               <w:rPr>
@@ -1793,6 +1821,33 @@
         </w:tc>
       </w:tr>
     </w:tbl>
+    <w:p>
+      <w:pPr>
+        <w:pStyle w:val="Heading1"/>
+      </w:pPr>
+    </w:p>
+    <w:p>
+      <w:pPr>
+        <w:rPr>
+          <w:rFonts w:asciiTheme="majorHAnsi" w:eastAsiaTheme="majorEastAsia" w:hAnsiTheme="majorHAnsi" w:cstheme="majorBidi"/>
+          <w:color w:val="2F5496" w:themeColor="accent1" w:themeShade="BF"/>
+          <w:sz w:val="32"/>
+          <w:szCs w:val="32"/>
+        </w:rPr>
+      </w:pPr>
+      <w:r>
+        <w:br w:type="page"/>
+      </w:r>
+    </w:p>
+    <w:p>
+      <w:pPr>
+        <w:pStyle w:val="Heading1"/>
+      </w:pPr>
+      <w:r>
+        <w:lastRenderedPageBreak/>
+        <w:t>End-of-Lesson Reflections</w:t>
+      </w:r>
+    </w:p>
     <w:p>
       <w:pPr>
         <w:keepNext/>
@@ -1806,7 +1861,7 @@
         <w:rPr>
           <w:b/>
         </w:rPr>
-        <w:t>Why must the game remember the A button’s previous state instead of only reading whether it is currently pressed?</w:t>
+        <w:t>Trace one movement input from the keyboard or gamepad through the JavaScript input state, player position update, and Canvas redraw</w:t>
       </w:r>
     </w:p>
     <w:tbl>
@@ -2034,7 +2089,6 @@
           </w:tcPr>
           <w:p>
             <w:pPr>
-              <w:keepNext w:val="0"/>
               <w:keepLines/>
               <w:spacing w:after="0"/>
               <w:rPr>
@@ -2059,7 +2113,15 @@
         <w:rPr>
           <w:b/>
         </w:rPr>
-        <w:t>Why is storing the level in an array more maintainable than writing separate collision code for every platform?</w:t>
+        <w:t>Why must the player's width and height be included when chec</w:t>
+      </w:r>
+      <w:bookmarkStart w:id="0" w:name="_GoBack"/>
+      <w:bookmarkEnd w:id="0"/>
+      <w:r>
+        <w:rPr>
+          <w:b/>
+        </w:rPr>
+        <w:t>king the right and bottom boundaries?</w:t>
       </w:r>
     </w:p>
     <w:tbl>
@@ -2287,7 +2349,6 @@
           </w:tcPr>
           <w:p>
             <w:pPr>
-              <w:keepNext w:val="0"/>
               <w:keepLines/>
               <w:spacing w:after="0"/>
               <w:rPr>
@@ -2312,7 +2373,29 @@
         <w:rPr>
           <w:b/>
         </w:rPr>
-        <w:t>Why is it useful to prove that overlap detection works before attempting to reposition the Player?</w:t>
+        <w:t xml:space="preserve">How does </w:t>
+      </w:r>
+      <w:proofErr w:type="spellStart"/>
+      <w:proofErr w:type="gramStart"/>
+      <w:r>
+        <w:rPr>
+          <w:b/>
+        </w:rPr>
+        <w:t>requestAnimationFrame</w:t>
+      </w:r>
+      <w:proofErr w:type="spellEnd"/>
+      <w:r>
+        <w:rPr>
+          <w:b/>
+        </w:rPr>
+        <w:t>(</w:t>
+      </w:r>
+      <w:proofErr w:type="gramEnd"/>
+      <w:r>
+        <w:rPr>
+          <w:b/>
+        </w:rPr>
+        <w:t>) allow input, movement, and drawing to work together continuously?</w:t>
       </w:r>
     </w:p>
     <w:tbl>
@@ -2540,7 +2623,6 @@
           </w:tcPr>
           <w:p>
             <w:pPr>
-              <w:keepNext w:val="0"/>
               <w:keepLines/>
               <w:spacing w:after="0"/>
               <w:rPr>
@@ -2552,2293 +2634,7 @@
         </w:tc>
       </w:tr>
     </w:tbl>
-    <w:p>
-      <w:pPr>
-        <w:keepNext/>
-        <w:keepLines/>
-        <w:spacing w:before="240"/>
-        <w:rPr>
-          <w:b/>
-        </w:rPr>
-      </w:pPr>
-      <w:r>
-        <w:rPr>
-          <w:b/>
-        </w:rPr>
-        <w:t>How does resolving one movement axis at a time make the collision direction easier to determine?</w:t>
-      </w:r>
-    </w:p>
-    <w:tbl>
-      <w:tblPr>
-        <w:tblW w:w="5000" w:type="pct"/>
-        <w:tblBorders>
-          <w:top w:val="single" w:sz="4" w:space="0" w:color="BFBFBF"/>
-          <w:left w:val="single" w:sz="4" w:space="0" w:color="BFBFBF"/>
-          <w:bottom w:val="single" w:sz="4" w:space="0" w:color="BFBFBF"/>
-          <w:right w:val="single" w:sz="4" w:space="0" w:color="BFBFBF"/>
-          <w:insideH w:val="single" w:sz="4" w:space="0" w:color="BFBFBF"/>
-          <w:insideV w:val="single" w:sz="4" w:space="0" w:color="BFBFBF"/>
-        </w:tblBorders>
-        <w:tblLook w:val="04A0" w:firstRow="1" w:lastRow="0" w:firstColumn="1" w:lastColumn="0" w:noHBand="0" w:noVBand="1"/>
-      </w:tblPr>
-      <w:tblGrid>
-        <w:gridCol w:w="10800"/>
-      </w:tblGrid>
-      <w:tr>
-        <w:trPr>
-          <w:cantSplit/>
-        </w:trPr>
-        <w:tc>
-          <w:tcPr>
-            <w:tcW w:w="5000" w:type="pct"/>
-            <w:tcBorders>
-              <w:top w:val="single" w:sz="8" w:space="0" w:color="000000"/>
-              <w:left w:val="nil"/>
-              <w:bottom w:val="nil"/>
-              <w:right w:val="nil"/>
-            </w:tcBorders>
-          </w:tcPr>
-          <w:p>
-            <w:pPr>
-              <w:keepNext/>
-              <w:keepLines/>
-              <w:spacing w:after="0"/>
-              <w:rPr>
-                <w:sz w:val="16"/>
-                <w:szCs w:val="16"/>
-              </w:rPr>
-            </w:pPr>
-          </w:p>
-        </w:tc>
-      </w:tr>
-      <w:tr>
-        <w:trPr>
-          <w:cantSplit/>
-        </w:trPr>
-        <w:tc>
-          <w:tcPr>
-            <w:tcW w:w="5000" w:type="pct"/>
-            <w:tcBorders>
-              <w:top w:val="nil"/>
-              <w:left w:val="nil"/>
-              <w:bottom w:val="single" w:sz="8" w:space="0" w:color="000000"/>
-              <w:right w:val="nil"/>
-            </w:tcBorders>
-            <w:shd w:val="clear" w:color="auto" w:fill="D9D9D9" w:themeFill="background1" w:themeFillShade="D9"/>
-          </w:tcPr>
-          <w:p>
-            <w:pPr>
-              <w:keepNext/>
-              <w:keepLines/>
-              <w:spacing w:after="0"/>
-              <w:rPr>
-                <w:sz w:val="16"/>
-                <w:szCs w:val="16"/>
-              </w:rPr>
-            </w:pPr>
-          </w:p>
-        </w:tc>
-      </w:tr>
-      <w:tr>
-        <w:trPr>
-          <w:cantSplit/>
-        </w:trPr>
-        <w:tc>
-          <w:tcPr>
-            <w:tcW w:w="5000" w:type="pct"/>
-            <w:tcBorders>
-              <w:top w:val="single" w:sz="8" w:space="0" w:color="000000"/>
-              <w:left w:val="nil"/>
-              <w:bottom w:val="nil"/>
-              <w:right w:val="nil"/>
-            </w:tcBorders>
-          </w:tcPr>
-          <w:p>
-            <w:pPr>
-              <w:keepNext/>
-              <w:keepLines/>
-              <w:spacing w:after="0"/>
-              <w:rPr>
-                <w:sz w:val="16"/>
-                <w:szCs w:val="16"/>
-              </w:rPr>
-            </w:pPr>
-          </w:p>
-        </w:tc>
-      </w:tr>
-      <w:tr>
-        <w:trPr>
-          <w:cantSplit/>
-        </w:trPr>
-        <w:tc>
-          <w:tcPr>
-            <w:tcW w:w="5000" w:type="pct"/>
-            <w:tcBorders>
-              <w:top w:val="nil"/>
-              <w:left w:val="nil"/>
-              <w:bottom w:val="single" w:sz="8" w:space="0" w:color="000000"/>
-              <w:right w:val="nil"/>
-            </w:tcBorders>
-            <w:shd w:val="clear" w:color="auto" w:fill="D9D9D9" w:themeFill="background1" w:themeFillShade="D9"/>
-          </w:tcPr>
-          <w:p>
-            <w:pPr>
-              <w:keepNext/>
-              <w:keepLines/>
-              <w:spacing w:after="0"/>
-              <w:rPr>
-                <w:sz w:val="16"/>
-                <w:szCs w:val="16"/>
-              </w:rPr>
-            </w:pPr>
-          </w:p>
-        </w:tc>
-      </w:tr>
-      <w:tr>
-        <w:trPr>
-          <w:cantSplit/>
-        </w:trPr>
-        <w:tc>
-          <w:tcPr>
-            <w:tcW w:w="5000" w:type="pct"/>
-            <w:tcBorders>
-              <w:top w:val="single" w:sz="8" w:space="0" w:color="000000"/>
-              <w:left w:val="nil"/>
-              <w:bottom w:val="nil"/>
-              <w:right w:val="nil"/>
-            </w:tcBorders>
-          </w:tcPr>
-          <w:p>
-            <w:pPr>
-              <w:keepNext/>
-              <w:keepLines/>
-              <w:spacing w:after="0"/>
-              <w:rPr>
-                <w:sz w:val="16"/>
-                <w:szCs w:val="16"/>
-              </w:rPr>
-            </w:pPr>
-          </w:p>
-        </w:tc>
-      </w:tr>
-      <w:tr>
-        <w:trPr>
-          <w:cantSplit/>
-        </w:trPr>
-        <w:tc>
-          <w:tcPr>
-            <w:tcW w:w="5000" w:type="pct"/>
-            <w:tcBorders>
-              <w:top w:val="nil"/>
-              <w:left w:val="nil"/>
-              <w:bottom w:val="single" w:sz="8" w:space="0" w:color="000000"/>
-              <w:right w:val="nil"/>
-            </w:tcBorders>
-            <w:shd w:val="clear" w:color="auto" w:fill="D9D9D9" w:themeFill="background1" w:themeFillShade="D9"/>
-          </w:tcPr>
-          <w:p>
-            <w:pPr>
-              <w:keepNext/>
-              <w:keepLines/>
-              <w:spacing w:after="0"/>
-              <w:rPr>
-                <w:sz w:val="16"/>
-                <w:szCs w:val="16"/>
-              </w:rPr>
-            </w:pPr>
-          </w:p>
-        </w:tc>
-      </w:tr>
-      <w:tr>
-        <w:trPr>
-          <w:cantSplit/>
-        </w:trPr>
-        <w:tc>
-          <w:tcPr>
-            <w:tcW w:w="5000" w:type="pct"/>
-            <w:tcBorders>
-              <w:top w:val="single" w:sz="8" w:space="0" w:color="000000"/>
-              <w:left w:val="nil"/>
-              <w:bottom w:val="nil"/>
-              <w:right w:val="nil"/>
-            </w:tcBorders>
-          </w:tcPr>
-          <w:p>
-            <w:pPr>
-              <w:keepNext/>
-              <w:keepLines/>
-              <w:spacing w:after="0"/>
-              <w:rPr>
-                <w:sz w:val="16"/>
-                <w:szCs w:val="16"/>
-              </w:rPr>
-            </w:pPr>
-          </w:p>
-        </w:tc>
-      </w:tr>
-      <w:tr>
-        <w:trPr>
-          <w:cantSplit/>
-        </w:trPr>
-        <w:tc>
-          <w:tcPr>
-            <w:tcW w:w="5000" w:type="pct"/>
-            <w:tcBorders>
-              <w:top w:val="nil"/>
-              <w:left w:val="nil"/>
-              <w:bottom w:val="single" w:sz="8" w:space="0" w:color="000000"/>
-              <w:right w:val="nil"/>
-            </w:tcBorders>
-            <w:shd w:val="clear" w:color="auto" w:fill="D9D9D9" w:themeFill="background1" w:themeFillShade="D9"/>
-          </w:tcPr>
-          <w:p>
-            <w:pPr>
-              <w:keepNext w:val="0"/>
-              <w:keepLines/>
-              <w:spacing w:after="0"/>
-              <w:rPr>
-                <w:sz w:val="16"/>
-                <w:szCs w:val="16"/>
-              </w:rPr>
-            </w:pPr>
-          </w:p>
-        </w:tc>
-      </w:tr>
-    </w:tbl>
-    <w:p>
-      <w:pPr>
-        <w:keepNext/>
-        <w:keepLines/>
-        <w:spacing w:before="240"/>
-        <w:rPr>
-          <w:b/>
-        </w:rPr>
-      </w:pPr>
-      <w:r>
-        <w:rPr>
-          <w:b/>
-        </w:rPr>
-        <w:t>Why would setting horizontal velocity to zero without correcting position leave the Player inside the Wall?</w:t>
-      </w:r>
-    </w:p>
-    <w:tbl>
-      <w:tblPr>
-        <w:tblW w:w="5000" w:type="pct"/>
-        <w:tblBorders>
-          <w:top w:val="single" w:sz="4" w:space="0" w:color="BFBFBF"/>
-          <w:left w:val="single" w:sz="4" w:space="0" w:color="BFBFBF"/>
-          <w:bottom w:val="single" w:sz="4" w:space="0" w:color="BFBFBF"/>
-          <w:right w:val="single" w:sz="4" w:space="0" w:color="BFBFBF"/>
-          <w:insideH w:val="single" w:sz="4" w:space="0" w:color="BFBFBF"/>
-          <w:insideV w:val="single" w:sz="4" w:space="0" w:color="BFBFBF"/>
-        </w:tblBorders>
-        <w:tblLook w:val="04A0" w:firstRow="1" w:lastRow="0" w:firstColumn="1" w:lastColumn="0" w:noHBand="0" w:noVBand="1"/>
-      </w:tblPr>
-      <w:tblGrid>
-        <w:gridCol w:w="10800"/>
-      </w:tblGrid>
-      <w:tr>
-        <w:trPr>
-          <w:cantSplit/>
-        </w:trPr>
-        <w:tc>
-          <w:tcPr>
-            <w:tcW w:w="5000" w:type="pct"/>
-            <w:tcBorders>
-              <w:top w:val="single" w:sz="8" w:space="0" w:color="000000"/>
-              <w:left w:val="nil"/>
-              <w:bottom w:val="nil"/>
-              <w:right w:val="nil"/>
-            </w:tcBorders>
-          </w:tcPr>
-          <w:p>
-            <w:pPr>
-              <w:keepNext/>
-              <w:keepLines/>
-              <w:spacing w:after="0"/>
-              <w:rPr>
-                <w:sz w:val="16"/>
-                <w:szCs w:val="16"/>
-              </w:rPr>
-            </w:pPr>
-          </w:p>
-        </w:tc>
-      </w:tr>
-      <w:tr>
-        <w:trPr>
-          <w:cantSplit/>
-        </w:trPr>
-        <w:tc>
-          <w:tcPr>
-            <w:tcW w:w="5000" w:type="pct"/>
-            <w:tcBorders>
-              <w:top w:val="nil"/>
-              <w:left w:val="nil"/>
-              <w:bottom w:val="single" w:sz="8" w:space="0" w:color="000000"/>
-              <w:right w:val="nil"/>
-            </w:tcBorders>
-            <w:shd w:val="clear" w:color="auto" w:fill="D9D9D9" w:themeFill="background1" w:themeFillShade="D9"/>
-          </w:tcPr>
-          <w:p>
-            <w:pPr>
-              <w:keepNext/>
-              <w:keepLines/>
-              <w:spacing w:after="0"/>
-              <w:rPr>
-                <w:sz w:val="16"/>
-                <w:szCs w:val="16"/>
-              </w:rPr>
-            </w:pPr>
-          </w:p>
-        </w:tc>
-      </w:tr>
-      <w:tr>
-        <w:trPr>
-          <w:cantSplit/>
-        </w:trPr>
-        <w:tc>
-          <w:tcPr>
-            <w:tcW w:w="5000" w:type="pct"/>
-            <w:tcBorders>
-              <w:top w:val="single" w:sz="8" w:space="0" w:color="000000"/>
-              <w:left w:val="nil"/>
-              <w:bottom w:val="nil"/>
-              <w:right w:val="nil"/>
-            </w:tcBorders>
-          </w:tcPr>
-          <w:p>
-            <w:pPr>
-              <w:keepNext/>
-              <w:keepLines/>
-              <w:spacing w:after="0"/>
-              <w:rPr>
-                <w:sz w:val="16"/>
-                <w:szCs w:val="16"/>
-              </w:rPr>
-            </w:pPr>
-          </w:p>
-        </w:tc>
-      </w:tr>
-      <w:tr>
-        <w:trPr>
-          <w:cantSplit/>
-        </w:trPr>
-        <w:tc>
-          <w:tcPr>
-            <w:tcW w:w="5000" w:type="pct"/>
-            <w:tcBorders>
-              <w:top w:val="nil"/>
-              <w:left w:val="nil"/>
-              <w:bottom w:val="single" w:sz="8" w:space="0" w:color="000000"/>
-              <w:right w:val="nil"/>
-            </w:tcBorders>
-            <w:shd w:val="clear" w:color="auto" w:fill="D9D9D9" w:themeFill="background1" w:themeFillShade="D9"/>
-          </w:tcPr>
-          <w:p>
-            <w:pPr>
-              <w:keepNext/>
-              <w:keepLines/>
-              <w:spacing w:after="0"/>
-              <w:rPr>
-                <w:sz w:val="16"/>
-                <w:szCs w:val="16"/>
-              </w:rPr>
-            </w:pPr>
-          </w:p>
-        </w:tc>
-      </w:tr>
-      <w:tr>
-        <w:trPr>
-          <w:cantSplit/>
-        </w:trPr>
-        <w:tc>
-          <w:tcPr>
-            <w:tcW w:w="5000" w:type="pct"/>
-            <w:tcBorders>
-              <w:top w:val="single" w:sz="8" w:space="0" w:color="000000"/>
-              <w:left w:val="nil"/>
-              <w:bottom w:val="nil"/>
-              <w:right w:val="nil"/>
-            </w:tcBorders>
-          </w:tcPr>
-          <w:p>
-            <w:pPr>
-              <w:keepNext/>
-              <w:keepLines/>
-              <w:spacing w:after="0"/>
-              <w:rPr>
-                <w:sz w:val="16"/>
-                <w:szCs w:val="16"/>
-              </w:rPr>
-            </w:pPr>
-          </w:p>
-        </w:tc>
-      </w:tr>
-      <w:tr>
-        <w:trPr>
-          <w:cantSplit/>
-        </w:trPr>
-        <w:tc>
-          <w:tcPr>
-            <w:tcW w:w="5000" w:type="pct"/>
-            <w:tcBorders>
-              <w:top w:val="nil"/>
-              <w:left w:val="nil"/>
-              <w:bottom w:val="single" w:sz="8" w:space="0" w:color="000000"/>
-              <w:right w:val="nil"/>
-            </w:tcBorders>
-            <w:shd w:val="clear" w:color="auto" w:fill="D9D9D9" w:themeFill="background1" w:themeFillShade="D9"/>
-          </w:tcPr>
-          <w:p>
-            <w:pPr>
-              <w:keepNext/>
-              <w:keepLines/>
-              <w:spacing w:after="0"/>
-              <w:rPr>
-                <w:sz w:val="16"/>
-                <w:szCs w:val="16"/>
-              </w:rPr>
-            </w:pPr>
-          </w:p>
-        </w:tc>
-      </w:tr>
-      <w:tr>
-        <w:trPr>
-          <w:cantSplit/>
-        </w:trPr>
-        <w:tc>
-          <w:tcPr>
-            <w:tcW w:w="5000" w:type="pct"/>
-            <w:tcBorders>
-              <w:top w:val="single" w:sz="8" w:space="0" w:color="000000"/>
-              <w:left w:val="nil"/>
-              <w:bottom w:val="nil"/>
-              <w:right w:val="nil"/>
-            </w:tcBorders>
-          </w:tcPr>
-          <w:p>
-            <w:pPr>
-              <w:keepNext/>
-              <w:keepLines/>
-              <w:spacing w:after="0"/>
-              <w:rPr>
-                <w:sz w:val="16"/>
-                <w:szCs w:val="16"/>
-              </w:rPr>
-            </w:pPr>
-          </w:p>
-        </w:tc>
-      </w:tr>
-      <w:tr>
-        <w:trPr>
-          <w:cantSplit/>
-        </w:trPr>
-        <w:tc>
-          <w:tcPr>
-            <w:tcW w:w="5000" w:type="pct"/>
-            <w:tcBorders>
-              <w:top w:val="nil"/>
-              <w:left w:val="nil"/>
-              <w:bottom w:val="single" w:sz="8" w:space="0" w:color="000000"/>
-              <w:right w:val="nil"/>
-            </w:tcBorders>
-            <w:shd w:val="clear" w:color="auto" w:fill="D9D9D9" w:themeFill="background1" w:themeFillShade="D9"/>
-          </w:tcPr>
-          <w:p>
-            <w:pPr>
-              <w:keepNext w:val="0"/>
-              <w:keepLines/>
-              <w:spacing w:after="0"/>
-              <w:rPr>
-                <w:sz w:val="16"/>
-                <w:szCs w:val="16"/>
-              </w:rPr>
-            </w:pPr>
-          </w:p>
-        </w:tc>
-      </w:tr>
-    </w:tbl>
-    <w:p>
-      <w:pPr>
-        <w:keepNext/>
-        <w:keepLines/>
-        <w:spacing w:before="240"/>
-        <w:rPr>
-          <w:b/>
-        </w:rPr>
-      </w:pPr>
-      <w:r>
-        <w:rPr>
-          <w:b/>
-        </w:rPr>
-        <w:t>Why must grounded be recalculated during every frame rather than remaining true after the first landing?</w:t>
-      </w:r>
-    </w:p>
-    <w:tbl>
-      <w:tblPr>
-        <w:tblW w:w="5000" w:type="pct"/>
-        <w:tblBorders>
-          <w:top w:val="single" w:sz="4" w:space="0" w:color="BFBFBF"/>
-          <w:left w:val="single" w:sz="4" w:space="0" w:color="BFBFBF"/>
-          <w:bottom w:val="single" w:sz="4" w:space="0" w:color="BFBFBF"/>
-          <w:right w:val="single" w:sz="4" w:space="0" w:color="BFBFBF"/>
-          <w:insideH w:val="single" w:sz="4" w:space="0" w:color="BFBFBF"/>
-          <w:insideV w:val="single" w:sz="4" w:space="0" w:color="BFBFBF"/>
-        </w:tblBorders>
-        <w:tblLook w:val="04A0" w:firstRow="1" w:lastRow="0" w:firstColumn="1" w:lastColumn="0" w:noHBand="0" w:noVBand="1"/>
-      </w:tblPr>
-      <w:tblGrid>
-        <w:gridCol w:w="10800"/>
-      </w:tblGrid>
-      <w:tr>
-        <w:trPr>
-          <w:cantSplit/>
-        </w:trPr>
-        <w:tc>
-          <w:tcPr>
-            <w:tcW w:w="5000" w:type="pct"/>
-            <w:tcBorders>
-              <w:top w:val="single" w:sz="8" w:space="0" w:color="000000"/>
-              <w:left w:val="nil"/>
-              <w:bottom w:val="nil"/>
-              <w:right w:val="nil"/>
-            </w:tcBorders>
-          </w:tcPr>
-          <w:p>
-            <w:pPr>
-              <w:keepNext/>
-              <w:keepLines/>
-              <w:spacing w:after="0"/>
-              <w:rPr>
-                <w:sz w:val="16"/>
-                <w:szCs w:val="16"/>
-              </w:rPr>
-            </w:pPr>
-          </w:p>
-        </w:tc>
-      </w:tr>
-      <w:tr>
-        <w:trPr>
-          <w:cantSplit/>
-        </w:trPr>
-        <w:tc>
-          <w:tcPr>
-            <w:tcW w:w="5000" w:type="pct"/>
-            <w:tcBorders>
-              <w:top w:val="nil"/>
-              <w:left w:val="nil"/>
-              <w:bottom w:val="single" w:sz="8" w:space="0" w:color="000000"/>
-              <w:right w:val="nil"/>
-            </w:tcBorders>
-            <w:shd w:val="clear" w:color="auto" w:fill="D9D9D9" w:themeFill="background1" w:themeFillShade="D9"/>
-          </w:tcPr>
-          <w:p>
-            <w:pPr>
-              <w:keepNext/>
-              <w:keepLines/>
-              <w:spacing w:after="0"/>
-              <w:rPr>
-                <w:sz w:val="16"/>
-                <w:szCs w:val="16"/>
-              </w:rPr>
-            </w:pPr>
-          </w:p>
-        </w:tc>
-      </w:tr>
-      <w:tr>
-        <w:trPr>
-          <w:cantSplit/>
-        </w:trPr>
-        <w:tc>
-          <w:tcPr>
-            <w:tcW w:w="5000" w:type="pct"/>
-            <w:tcBorders>
-              <w:top w:val="single" w:sz="8" w:space="0" w:color="000000"/>
-              <w:left w:val="nil"/>
-              <w:bottom w:val="nil"/>
-              <w:right w:val="nil"/>
-            </w:tcBorders>
-          </w:tcPr>
-          <w:p>
-            <w:pPr>
-              <w:keepNext/>
-              <w:keepLines/>
-              <w:spacing w:after="0"/>
-              <w:rPr>
-                <w:sz w:val="16"/>
-                <w:szCs w:val="16"/>
-              </w:rPr>
-            </w:pPr>
-          </w:p>
-        </w:tc>
-      </w:tr>
-      <w:tr>
-        <w:trPr>
-          <w:cantSplit/>
-        </w:trPr>
-        <w:tc>
-          <w:tcPr>
-            <w:tcW w:w="5000" w:type="pct"/>
-            <w:tcBorders>
-              <w:top w:val="nil"/>
-              <w:left w:val="nil"/>
-              <w:bottom w:val="single" w:sz="8" w:space="0" w:color="000000"/>
-              <w:right w:val="nil"/>
-            </w:tcBorders>
-            <w:shd w:val="clear" w:color="auto" w:fill="D9D9D9" w:themeFill="background1" w:themeFillShade="D9"/>
-          </w:tcPr>
-          <w:p>
-            <w:pPr>
-              <w:keepNext/>
-              <w:keepLines/>
-              <w:spacing w:after="0"/>
-              <w:rPr>
-                <w:sz w:val="16"/>
-                <w:szCs w:val="16"/>
-              </w:rPr>
-            </w:pPr>
-          </w:p>
-        </w:tc>
-      </w:tr>
-      <w:tr>
-        <w:trPr>
-          <w:cantSplit/>
-        </w:trPr>
-        <w:tc>
-          <w:tcPr>
-            <w:tcW w:w="5000" w:type="pct"/>
-            <w:tcBorders>
-              <w:top w:val="single" w:sz="8" w:space="0" w:color="000000"/>
-              <w:left w:val="nil"/>
-              <w:bottom w:val="nil"/>
-              <w:right w:val="nil"/>
-            </w:tcBorders>
-          </w:tcPr>
-          <w:p>
-            <w:pPr>
-              <w:keepNext/>
-              <w:keepLines/>
-              <w:spacing w:after="0"/>
-              <w:rPr>
-                <w:sz w:val="16"/>
-                <w:szCs w:val="16"/>
-              </w:rPr>
-            </w:pPr>
-          </w:p>
-        </w:tc>
-      </w:tr>
-      <w:tr>
-        <w:trPr>
-          <w:cantSplit/>
-        </w:trPr>
-        <w:tc>
-          <w:tcPr>
-            <w:tcW w:w="5000" w:type="pct"/>
-            <w:tcBorders>
-              <w:top w:val="nil"/>
-              <w:left w:val="nil"/>
-              <w:bottom w:val="single" w:sz="8" w:space="0" w:color="000000"/>
-              <w:right w:val="nil"/>
-            </w:tcBorders>
-            <w:shd w:val="clear" w:color="auto" w:fill="D9D9D9" w:themeFill="background1" w:themeFillShade="D9"/>
-          </w:tcPr>
-          <w:p>
-            <w:pPr>
-              <w:keepNext/>
-              <w:keepLines/>
-              <w:spacing w:after="0"/>
-              <w:rPr>
-                <w:sz w:val="16"/>
-                <w:szCs w:val="16"/>
-              </w:rPr>
-            </w:pPr>
-          </w:p>
-        </w:tc>
-      </w:tr>
-      <w:tr>
-        <w:trPr>
-          <w:cantSplit/>
-        </w:trPr>
-        <w:tc>
-          <w:tcPr>
-            <w:tcW w:w="5000" w:type="pct"/>
-            <w:tcBorders>
-              <w:top w:val="single" w:sz="8" w:space="0" w:color="000000"/>
-              <w:left w:val="nil"/>
-              <w:bottom w:val="nil"/>
-              <w:right w:val="nil"/>
-            </w:tcBorders>
-          </w:tcPr>
-          <w:p>
-            <w:pPr>
-              <w:keepNext/>
-              <w:keepLines/>
-              <w:spacing w:after="0"/>
-              <w:rPr>
-                <w:sz w:val="16"/>
-                <w:szCs w:val="16"/>
-              </w:rPr>
-            </w:pPr>
-          </w:p>
-        </w:tc>
-      </w:tr>
-      <w:tr>
-        <w:trPr>
-          <w:cantSplit/>
-        </w:trPr>
-        <w:tc>
-          <w:tcPr>
-            <w:tcW w:w="5000" w:type="pct"/>
-            <w:tcBorders>
-              <w:top w:val="nil"/>
-              <w:left w:val="nil"/>
-              <w:bottom w:val="single" w:sz="8" w:space="0" w:color="000000"/>
-              <w:right w:val="nil"/>
-            </w:tcBorders>
-            <w:shd w:val="clear" w:color="auto" w:fill="D9D9D9" w:themeFill="background1" w:themeFillShade="D9"/>
-          </w:tcPr>
-          <w:p>
-            <w:pPr>
-              <w:keepNext w:val="0"/>
-              <w:keepLines/>
-              <w:spacing w:after="0"/>
-              <w:rPr>
-                <w:sz w:val="16"/>
-                <w:szCs w:val="16"/>
-              </w:rPr>
-            </w:pPr>
-          </w:p>
-        </w:tc>
-      </w:tr>
-    </w:tbl>
-    <w:p>
-      <w:pPr>
-        <w:keepNext/>
-        <w:keepLines/>
-        <w:spacing w:before="240"/>
-        <w:rPr>
-          <w:b/>
-        </w:rPr>
-      </w:pPr>
-      <w:r>
-        <w:rPr>
-          <w:b/>
-        </w:rPr>
-        <w:t>Why is hitting the underside of a platform not considered a landing?</w:t>
-      </w:r>
-    </w:p>
-    <w:tbl>
-      <w:tblPr>
-        <w:tblW w:w="5000" w:type="pct"/>
-        <w:tblBorders>
-          <w:top w:val="single" w:sz="4" w:space="0" w:color="BFBFBF"/>
-          <w:left w:val="single" w:sz="4" w:space="0" w:color="BFBFBF"/>
-          <w:bottom w:val="single" w:sz="4" w:space="0" w:color="BFBFBF"/>
-          <w:right w:val="single" w:sz="4" w:space="0" w:color="BFBFBF"/>
-          <w:insideH w:val="single" w:sz="4" w:space="0" w:color="BFBFBF"/>
-          <w:insideV w:val="single" w:sz="4" w:space="0" w:color="BFBFBF"/>
-        </w:tblBorders>
-        <w:tblLook w:val="04A0" w:firstRow="1" w:lastRow="0" w:firstColumn="1" w:lastColumn="0" w:noHBand="0" w:noVBand="1"/>
-      </w:tblPr>
-      <w:tblGrid>
-        <w:gridCol w:w="10800"/>
-      </w:tblGrid>
-      <w:tr>
-        <w:trPr>
-          <w:cantSplit/>
-        </w:trPr>
-        <w:tc>
-          <w:tcPr>
-            <w:tcW w:w="5000" w:type="pct"/>
-            <w:tcBorders>
-              <w:top w:val="single" w:sz="8" w:space="0" w:color="000000"/>
-              <w:left w:val="nil"/>
-              <w:bottom w:val="nil"/>
-              <w:right w:val="nil"/>
-            </w:tcBorders>
-          </w:tcPr>
-          <w:p>
-            <w:pPr>
-              <w:keepNext/>
-              <w:keepLines/>
-              <w:spacing w:after="0"/>
-              <w:rPr>
-                <w:sz w:val="16"/>
-                <w:szCs w:val="16"/>
-              </w:rPr>
-            </w:pPr>
-          </w:p>
-        </w:tc>
-      </w:tr>
-      <w:tr>
-        <w:trPr>
-          <w:cantSplit/>
-        </w:trPr>
-        <w:tc>
-          <w:tcPr>
-            <w:tcW w:w="5000" w:type="pct"/>
-            <w:tcBorders>
-              <w:top w:val="nil"/>
-              <w:left w:val="nil"/>
-              <w:bottom w:val="single" w:sz="8" w:space="0" w:color="000000"/>
-              <w:right w:val="nil"/>
-            </w:tcBorders>
-            <w:shd w:val="clear" w:color="auto" w:fill="D9D9D9" w:themeFill="background1" w:themeFillShade="D9"/>
-          </w:tcPr>
-          <w:p>
-            <w:pPr>
-              <w:keepNext/>
-              <w:keepLines/>
-              <w:spacing w:after="0"/>
-              <w:rPr>
-                <w:sz w:val="16"/>
-                <w:szCs w:val="16"/>
-              </w:rPr>
-            </w:pPr>
-          </w:p>
-        </w:tc>
-      </w:tr>
-      <w:tr>
-        <w:trPr>
-          <w:cantSplit/>
-        </w:trPr>
-        <w:tc>
-          <w:tcPr>
-            <w:tcW w:w="5000" w:type="pct"/>
-            <w:tcBorders>
-              <w:top w:val="single" w:sz="8" w:space="0" w:color="000000"/>
-              <w:left w:val="nil"/>
-              <w:bottom w:val="nil"/>
-              <w:right w:val="nil"/>
-            </w:tcBorders>
-          </w:tcPr>
-          <w:p>
-            <w:pPr>
-              <w:keepNext/>
-              <w:keepLines/>
-              <w:spacing w:after="0"/>
-              <w:rPr>
-                <w:sz w:val="16"/>
-                <w:szCs w:val="16"/>
-              </w:rPr>
-            </w:pPr>
-          </w:p>
-        </w:tc>
-      </w:tr>
-      <w:tr>
-        <w:trPr>
-          <w:cantSplit/>
-        </w:trPr>
-        <w:tc>
-          <w:tcPr>
-            <w:tcW w:w="5000" w:type="pct"/>
-            <w:tcBorders>
-              <w:top w:val="nil"/>
-              <w:left w:val="nil"/>
-              <w:bottom w:val="single" w:sz="8" w:space="0" w:color="000000"/>
-              <w:right w:val="nil"/>
-            </w:tcBorders>
-            <w:shd w:val="clear" w:color="auto" w:fill="D9D9D9" w:themeFill="background1" w:themeFillShade="D9"/>
-          </w:tcPr>
-          <w:p>
-            <w:pPr>
-              <w:keepNext/>
-              <w:keepLines/>
-              <w:spacing w:after="0"/>
-              <w:rPr>
-                <w:sz w:val="16"/>
-                <w:szCs w:val="16"/>
-              </w:rPr>
-            </w:pPr>
-          </w:p>
-        </w:tc>
-      </w:tr>
-      <w:tr>
-        <w:trPr>
-          <w:cantSplit/>
-        </w:trPr>
-        <w:tc>
-          <w:tcPr>
-            <w:tcW w:w="5000" w:type="pct"/>
-            <w:tcBorders>
-              <w:top w:val="single" w:sz="8" w:space="0" w:color="000000"/>
-              <w:left w:val="nil"/>
-              <w:bottom w:val="nil"/>
-              <w:right w:val="nil"/>
-            </w:tcBorders>
-          </w:tcPr>
-          <w:p>
-            <w:pPr>
-              <w:keepNext/>
-              <w:keepLines/>
-              <w:spacing w:after="0"/>
-              <w:rPr>
-                <w:sz w:val="16"/>
-                <w:szCs w:val="16"/>
-              </w:rPr>
-            </w:pPr>
-          </w:p>
-        </w:tc>
-      </w:tr>
-      <w:tr>
-        <w:trPr>
-          <w:cantSplit/>
-        </w:trPr>
-        <w:tc>
-          <w:tcPr>
-            <w:tcW w:w="5000" w:type="pct"/>
-            <w:tcBorders>
-              <w:top w:val="nil"/>
-              <w:left w:val="nil"/>
-              <w:bottom w:val="single" w:sz="8" w:space="0" w:color="000000"/>
-              <w:right w:val="nil"/>
-            </w:tcBorders>
-            <w:shd w:val="clear" w:color="auto" w:fill="D9D9D9" w:themeFill="background1" w:themeFillShade="D9"/>
-          </w:tcPr>
-          <w:p>
-            <w:pPr>
-              <w:keepNext/>
-              <w:keepLines/>
-              <w:spacing w:after="0"/>
-              <w:rPr>
-                <w:sz w:val="16"/>
-                <w:szCs w:val="16"/>
-              </w:rPr>
-            </w:pPr>
-          </w:p>
-        </w:tc>
-      </w:tr>
-      <w:tr>
-        <w:trPr>
-          <w:cantSplit/>
-        </w:trPr>
-        <w:tc>
-          <w:tcPr>
-            <w:tcW w:w="5000" w:type="pct"/>
-            <w:tcBorders>
-              <w:top w:val="single" w:sz="8" w:space="0" w:color="000000"/>
-              <w:left w:val="nil"/>
-              <w:bottom w:val="nil"/>
-              <w:right w:val="nil"/>
-            </w:tcBorders>
-          </w:tcPr>
-          <w:p>
-            <w:pPr>
-              <w:keepNext/>
-              <w:keepLines/>
-              <w:spacing w:after="0"/>
-              <w:rPr>
-                <w:sz w:val="16"/>
-                <w:szCs w:val="16"/>
-              </w:rPr>
-            </w:pPr>
-          </w:p>
-        </w:tc>
-      </w:tr>
-      <w:tr>
-        <w:trPr>
-          <w:cantSplit/>
-        </w:trPr>
-        <w:tc>
-          <w:tcPr>
-            <w:tcW w:w="5000" w:type="pct"/>
-            <w:tcBorders>
-              <w:top w:val="nil"/>
-              <w:left w:val="nil"/>
-              <w:bottom w:val="single" w:sz="8" w:space="0" w:color="000000"/>
-              <w:right w:val="nil"/>
-            </w:tcBorders>
-            <w:shd w:val="clear" w:color="auto" w:fill="D9D9D9" w:themeFill="background1" w:themeFillShade="D9"/>
-          </w:tcPr>
-          <w:p>
-            <w:pPr>
-              <w:keepNext w:val="0"/>
-              <w:keepLines/>
-              <w:spacing w:after="0"/>
-              <w:rPr>
-                <w:sz w:val="16"/>
-                <w:szCs w:val="16"/>
-              </w:rPr>
-            </w:pPr>
-          </w:p>
-        </w:tc>
-      </w:tr>
-    </w:tbl>
-    <w:p>
-      <w:pPr>
-        <w:keepNext/>
-        <w:keepLines/>
-        <w:spacing w:before="240"/>
-        <w:rPr>
-          <w:b/>
-        </w:rPr>
-      </w:pPr>
-      <w:r>
-        <w:rPr>
-          <w:b/>
-        </w:rPr>
-        <w:t>Why should the game stop updating after the Player has fallen outside the playable area?</w:t>
-      </w:r>
-    </w:p>
-    <w:tbl>
-      <w:tblPr>
-        <w:tblW w:w="5000" w:type="pct"/>
-        <w:tblBorders>
-          <w:top w:val="single" w:sz="4" w:space="0" w:color="BFBFBF"/>
-          <w:left w:val="single" w:sz="4" w:space="0" w:color="BFBFBF"/>
-          <w:bottom w:val="single" w:sz="4" w:space="0" w:color="BFBFBF"/>
-          <w:right w:val="single" w:sz="4" w:space="0" w:color="BFBFBF"/>
-          <w:insideH w:val="single" w:sz="4" w:space="0" w:color="BFBFBF"/>
-          <w:insideV w:val="single" w:sz="4" w:space="0" w:color="BFBFBF"/>
-        </w:tblBorders>
-        <w:tblLook w:val="04A0" w:firstRow="1" w:lastRow="0" w:firstColumn="1" w:lastColumn="0" w:noHBand="0" w:noVBand="1"/>
-      </w:tblPr>
-      <w:tblGrid>
-        <w:gridCol w:w="10800"/>
-      </w:tblGrid>
-      <w:tr>
-        <w:trPr>
-          <w:cantSplit/>
-        </w:trPr>
-        <w:tc>
-          <w:tcPr>
-            <w:tcW w:w="5000" w:type="pct"/>
-            <w:tcBorders>
-              <w:top w:val="single" w:sz="8" w:space="0" w:color="000000"/>
-              <w:left w:val="nil"/>
-              <w:bottom w:val="nil"/>
-              <w:right w:val="nil"/>
-            </w:tcBorders>
-          </w:tcPr>
-          <w:p>
-            <w:pPr>
-              <w:keepNext/>
-              <w:keepLines/>
-              <w:spacing w:after="0"/>
-              <w:rPr>
-                <w:sz w:val="16"/>
-                <w:szCs w:val="16"/>
-              </w:rPr>
-            </w:pPr>
-          </w:p>
-        </w:tc>
-      </w:tr>
-      <w:tr>
-        <w:trPr>
-          <w:cantSplit/>
-        </w:trPr>
-        <w:tc>
-          <w:tcPr>
-            <w:tcW w:w="5000" w:type="pct"/>
-            <w:tcBorders>
-              <w:top w:val="nil"/>
-              <w:left w:val="nil"/>
-              <w:bottom w:val="single" w:sz="8" w:space="0" w:color="000000"/>
-              <w:right w:val="nil"/>
-            </w:tcBorders>
-            <w:shd w:val="clear" w:color="auto" w:fill="D9D9D9" w:themeFill="background1" w:themeFillShade="D9"/>
-          </w:tcPr>
-          <w:p>
-            <w:pPr>
-              <w:keepNext/>
-              <w:keepLines/>
-              <w:spacing w:after="0"/>
-              <w:rPr>
-                <w:sz w:val="16"/>
-                <w:szCs w:val="16"/>
-              </w:rPr>
-            </w:pPr>
-          </w:p>
-        </w:tc>
-      </w:tr>
-      <w:tr>
-        <w:trPr>
-          <w:cantSplit/>
-        </w:trPr>
-        <w:tc>
-          <w:tcPr>
-            <w:tcW w:w="5000" w:type="pct"/>
-            <w:tcBorders>
-              <w:top w:val="single" w:sz="8" w:space="0" w:color="000000"/>
-              <w:left w:val="nil"/>
-              <w:bottom w:val="nil"/>
-              <w:right w:val="nil"/>
-            </w:tcBorders>
-          </w:tcPr>
-          <w:p>
-            <w:pPr>
-              <w:keepNext/>
-              <w:keepLines/>
-              <w:spacing w:after="0"/>
-              <w:rPr>
-                <w:sz w:val="16"/>
-                <w:szCs w:val="16"/>
-              </w:rPr>
-            </w:pPr>
-          </w:p>
-        </w:tc>
-      </w:tr>
-      <w:tr>
-        <w:trPr>
-          <w:cantSplit/>
-        </w:trPr>
-        <w:tc>
-          <w:tcPr>
-            <w:tcW w:w="5000" w:type="pct"/>
-            <w:tcBorders>
-              <w:top w:val="nil"/>
-              <w:left w:val="nil"/>
-              <w:bottom w:val="single" w:sz="8" w:space="0" w:color="000000"/>
-              <w:right w:val="nil"/>
-            </w:tcBorders>
-            <w:shd w:val="clear" w:color="auto" w:fill="D9D9D9" w:themeFill="background1" w:themeFillShade="D9"/>
-          </w:tcPr>
-          <w:p>
-            <w:pPr>
-              <w:keepNext/>
-              <w:keepLines/>
-              <w:spacing w:after="0"/>
-              <w:rPr>
-                <w:sz w:val="16"/>
-                <w:szCs w:val="16"/>
-              </w:rPr>
-            </w:pPr>
-          </w:p>
-        </w:tc>
-      </w:tr>
-      <w:tr>
-        <w:trPr>
-          <w:cantSplit/>
-        </w:trPr>
-        <w:tc>
-          <w:tcPr>
-            <w:tcW w:w="5000" w:type="pct"/>
-            <w:tcBorders>
-              <w:top w:val="single" w:sz="8" w:space="0" w:color="000000"/>
-              <w:left w:val="nil"/>
-              <w:bottom w:val="nil"/>
-              <w:right w:val="nil"/>
-            </w:tcBorders>
-          </w:tcPr>
-          <w:p>
-            <w:pPr>
-              <w:keepNext/>
-              <w:keepLines/>
-              <w:spacing w:after="0"/>
-              <w:rPr>
-                <w:sz w:val="16"/>
-                <w:szCs w:val="16"/>
-              </w:rPr>
-            </w:pPr>
-          </w:p>
-        </w:tc>
-      </w:tr>
-      <w:tr>
-        <w:trPr>
-          <w:cantSplit/>
-        </w:trPr>
-        <w:tc>
-          <w:tcPr>
-            <w:tcW w:w="5000" w:type="pct"/>
-            <w:tcBorders>
-              <w:top w:val="nil"/>
-              <w:left w:val="nil"/>
-              <w:bottom w:val="single" w:sz="8" w:space="0" w:color="000000"/>
-              <w:right w:val="nil"/>
-            </w:tcBorders>
-            <w:shd w:val="clear" w:color="auto" w:fill="D9D9D9" w:themeFill="background1" w:themeFillShade="D9"/>
-          </w:tcPr>
-          <w:p>
-            <w:pPr>
-              <w:keepNext/>
-              <w:keepLines/>
-              <w:spacing w:after="0"/>
-              <w:rPr>
-                <w:sz w:val="16"/>
-                <w:szCs w:val="16"/>
-              </w:rPr>
-            </w:pPr>
-          </w:p>
-        </w:tc>
-      </w:tr>
-      <w:tr>
-        <w:trPr>
-          <w:cantSplit/>
-        </w:trPr>
-        <w:tc>
-          <w:tcPr>
-            <w:tcW w:w="5000" w:type="pct"/>
-            <w:tcBorders>
-              <w:top w:val="single" w:sz="8" w:space="0" w:color="000000"/>
-              <w:left w:val="nil"/>
-              <w:bottom w:val="nil"/>
-              <w:right w:val="nil"/>
-            </w:tcBorders>
-          </w:tcPr>
-          <w:p>
-            <w:pPr>
-              <w:keepNext/>
-              <w:keepLines/>
-              <w:spacing w:after="0"/>
-              <w:rPr>
-                <w:sz w:val="16"/>
-                <w:szCs w:val="16"/>
-              </w:rPr>
-            </w:pPr>
-          </w:p>
-        </w:tc>
-      </w:tr>
-      <w:tr>
-        <w:trPr>
-          <w:cantSplit/>
-        </w:trPr>
-        <w:tc>
-          <w:tcPr>
-            <w:tcW w:w="5000" w:type="pct"/>
-            <w:tcBorders>
-              <w:top w:val="nil"/>
-              <w:left w:val="nil"/>
-              <w:bottom w:val="single" w:sz="8" w:space="0" w:color="000000"/>
-              <w:right w:val="nil"/>
-            </w:tcBorders>
-            <w:shd w:val="clear" w:color="auto" w:fill="D9D9D9" w:themeFill="background1" w:themeFillShade="D9"/>
-          </w:tcPr>
-          <w:p>
-            <w:pPr>
-              <w:keepNext w:val="0"/>
-              <w:keepLines/>
-              <w:spacing w:after="0"/>
-              <w:rPr>
-                <w:sz w:val="16"/>
-                <w:szCs w:val="16"/>
-              </w:rPr>
-            </w:pPr>
-          </w:p>
-        </w:tc>
-      </w:tr>
-    </w:tbl>
-    <w:p>
-      <w:pPr>
-        <w:keepNext/>
-        <w:keepLines/>
-        <w:spacing w:before="240"/>
-        <w:rPr>
-          <w:b/>
-        </w:rPr>
-      </w:pPr>
-      <w:r>
-        <w:rPr>
-          <w:b/>
-        </w:rPr>
-        <w:t>Why is testing each added feature before building the next feature more effective than debugging the entire platformer at the end?</w:t>
-      </w:r>
-    </w:p>
-    <w:tbl>
-      <w:tblPr>
-        <w:tblW w:w="5000" w:type="pct"/>
-        <w:tblBorders>
-          <w:top w:val="single" w:sz="4" w:space="0" w:color="BFBFBF"/>
-          <w:left w:val="single" w:sz="4" w:space="0" w:color="BFBFBF"/>
-          <w:bottom w:val="single" w:sz="4" w:space="0" w:color="BFBFBF"/>
-          <w:right w:val="single" w:sz="4" w:space="0" w:color="BFBFBF"/>
-          <w:insideH w:val="single" w:sz="4" w:space="0" w:color="BFBFBF"/>
-          <w:insideV w:val="single" w:sz="4" w:space="0" w:color="BFBFBF"/>
-        </w:tblBorders>
-        <w:tblLook w:val="04A0" w:firstRow="1" w:lastRow="0" w:firstColumn="1" w:lastColumn="0" w:noHBand="0" w:noVBand="1"/>
-      </w:tblPr>
-      <w:tblGrid>
-        <w:gridCol w:w="10800"/>
-      </w:tblGrid>
-      <w:tr>
-        <w:trPr>
-          <w:cantSplit/>
-        </w:trPr>
-        <w:tc>
-          <w:tcPr>
-            <w:tcW w:w="5000" w:type="pct"/>
-            <w:tcBorders>
-              <w:top w:val="single" w:sz="8" w:space="0" w:color="000000"/>
-              <w:left w:val="nil"/>
-              <w:bottom w:val="nil"/>
-              <w:right w:val="nil"/>
-            </w:tcBorders>
-          </w:tcPr>
-          <w:p>
-            <w:pPr>
-              <w:keepNext/>
-              <w:keepLines/>
-              <w:spacing w:after="0"/>
-              <w:rPr>
-                <w:sz w:val="16"/>
-                <w:szCs w:val="16"/>
-              </w:rPr>
-            </w:pPr>
-          </w:p>
-        </w:tc>
-      </w:tr>
-      <w:tr>
-        <w:trPr>
-          <w:cantSplit/>
-        </w:trPr>
-        <w:tc>
-          <w:tcPr>
-            <w:tcW w:w="5000" w:type="pct"/>
-            <w:tcBorders>
-              <w:top w:val="nil"/>
-              <w:left w:val="nil"/>
-              <w:bottom w:val="single" w:sz="8" w:space="0" w:color="000000"/>
-              <w:right w:val="nil"/>
-            </w:tcBorders>
-            <w:shd w:val="clear" w:color="auto" w:fill="D9D9D9" w:themeFill="background1" w:themeFillShade="D9"/>
-          </w:tcPr>
-          <w:p>
-            <w:pPr>
-              <w:keepNext/>
-              <w:keepLines/>
-              <w:spacing w:after="0"/>
-              <w:rPr>
-                <w:sz w:val="16"/>
-                <w:szCs w:val="16"/>
-              </w:rPr>
-            </w:pPr>
-          </w:p>
-        </w:tc>
-      </w:tr>
-      <w:tr>
-        <w:trPr>
-          <w:cantSplit/>
-        </w:trPr>
-        <w:tc>
-          <w:tcPr>
-            <w:tcW w:w="5000" w:type="pct"/>
-            <w:tcBorders>
-              <w:top w:val="single" w:sz="8" w:space="0" w:color="000000"/>
-              <w:left w:val="nil"/>
-              <w:bottom w:val="nil"/>
-              <w:right w:val="nil"/>
-            </w:tcBorders>
-          </w:tcPr>
-          <w:p>
-            <w:pPr>
-              <w:keepNext/>
-              <w:keepLines/>
-              <w:spacing w:after="0"/>
-              <w:rPr>
-                <w:sz w:val="16"/>
-                <w:szCs w:val="16"/>
-              </w:rPr>
-            </w:pPr>
-          </w:p>
-        </w:tc>
-      </w:tr>
-      <w:tr>
-        <w:trPr>
-          <w:cantSplit/>
-        </w:trPr>
-        <w:tc>
-          <w:tcPr>
-            <w:tcW w:w="5000" w:type="pct"/>
-            <w:tcBorders>
-              <w:top w:val="nil"/>
-              <w:left w:val="nil"/>
-              <w:bottom w:val="single" w:sz="8" w:space="0" w:color="000000"/>
-              <w:right w:val="nil"/>
-            </w:tcBorders>
-            <w:shd w:val="clear" w:color="auto" w:fill="D9D9D9" w:themeFill="background1" w:themeFillShade="D9"/>
-          </w:tcPr>
-          <w:p>
-            <w:pPr>
-              <w:keepNext/>
-              <w:keepLines/>
-              <w:spacing w:after="0"/>
-              <w:rPr>
-                <w:sz w:val="16"/>
-                <w:szCs w:val="16"/>
-              </w:rPr>
-            </w:pPr>
-          </w:p>
-        </w:tc>
-      </w:tr>
-      <w:tr>
-        <w:trPr>
-          <w:cantSplit/>
-        </w:trPr>
-        <w:tc>
-          <w:tcPr>
-            <w:tcW w:w="5000" w:type="pct"/>
-            <w:tcBorders>
-              <w:top w:val="single" w:sz="8" w:space="0" w:color="000000"/>
-              <w:left w:val="nil"/>
-              <w:bottom w:val="nil"/>
-              <w:right w:val="nil"/>
-            </w:tcBorders>
-          </w:tcPr>
-          <w:p>
-            <w:pPr>
-              <w:keepNext/>
-              <w:keepLines/>
-              <w:spacing w:after="0"/>
-              <w:rPr>
-                <w:sz w:val="16"/>
-                <w:szCs w:val="16"/>
-              </w:rPr>
-            </w:pPr>
-          </w:p>
-        </w:tc>
-      </w:tr>
-      <w:tr>
-        <w:trPr>
-          <w:cantSplit/>
-        </w:trPr>
-        <w:tc>
-          <w:tcPr>
-            <w:tcW w:w="5000" w:type="pct"/>
-            <w:tcBorders>
-              <w:top w:val="nil"/>
-              <w:left w:val="nil"/>
-              <w:bottom w:val="single" w:sz="8" w:space="0" w:color="000000"/>
-              <w:right w:val="nil"/>
-            </w:tcBorders>
-            <w:shd w:val="clear" w:color="auto" w:fill="D9D9D9" w:themeFill="background1" w:themeFillShade="D9"/>
-          </w:tcPr>
-          <w:p>
-            <w:pPr>
-              <w:keepNext/>
-              <w:keepLines/>
-              <w:spacing w:after="0"/>
-              <w:rPr>
-                <w:sz w:val="16"/>
-                <w:szCs w:val="16"/>
-              </w:rPr>
-            </w:pPr>
-          </w:p>
-        </w:tc>
-      </w:tr>
-      <w:tr>
-        <w:trPr>
-          <w:cantSplit/>
-        </w:trPr>
-        <w:tc>
-          <w:tcPr>
-            <w:tcW w:w="5000" w:type="pct"/>
-            <w:tcBorders>
-              <w:top w:val="single" w:sz="8" w:space="0" w:color="000000"/>
-              <w:left w:val="nil"/>
-              <w:bottom w:val="nil"/>
-              <w:right w:val="nil"/>
-            </w:tcBorders>
-          </w:tcPr>
-          <w:p>
-            <w:pPr>
-              <w:keepNext/>
-              <w:keepLines/>
-              <w:spacing w:after="0"/>
-              <w:rPr>
-                <w:sz w:val="16"/>
-                <w:szCs w:val="16"/>
-              </w:rPr>
-            </w:pPr>
-          </w:p>
-        </w:tc>
-      </w:tr>
-      <w:tr>
-        <w:trPr>
-          <w:cantSplit/>
-        </w:trPr>
-        <w:tc>
-          <w:tcPr>
-            <w:tcW w:w="5000" w:type="pct"/>
-            <w:tcBorders>
-              <w:top w:val="nil"/>
-              <w:left w:val="nil"/>
-              <w:bottom w:val="single" w:sz="8" w:space="0" w:color="000000"/>
-              <w:right w:val="nil"/>
-            </w:tcBorders>
-            <w:shd w:val="clear" w:color="auto" w:fill="D9D9D9" w:themeFill="background1" w:themeFillShade="D9"/>
-          </w:tcPr>
-          <w:p>
-            <w:pPr>
-              <w:keepNext w:val="0"/>
-              <w:keepLines/>
-              <w:spacing w:after="0"/>
-              <w:rPr>
-                <w:sz w:val="16"/>
-                <w:szCs w:val="16"/>
-              </w:rPr>
-            </w:pPr>
-          </w:p>
-        </w:tc>
-      </w:tr>
-    </w:tbl>
-    <w:p>
-      <w:pPr>
-        <w:pStyle w:val="Heading1"/>
-        <w:keepNext/>
-        <w:keepLines/>
-      </w:pPr>
-      <w:r>
-        <w:t>End-of-Lesson Reflections</w:t>
-      </w:r>
-    </w:p>
-    <w:p>
-      <w:pPr>
-        <w:keepNext/>
-        <w:keepLines/>
-        <w:spacing w:before="240"/>
-        <w:rPr>
-          <w:b/>
-        </w:rPr>
-      </w:pPr>
-      <w:r>
-        <w:rPr>
-          <w:b/>
-        </w:rPr>
-        <w:t>Trace one jump from the A-button press through vertical velocity, gravity, collision detection, and platform landing.</w:t>
-      </w:r>
-    </w:p>
-    <w:tbl>
-      <w:tblPr>
-        <w:tblW w:w="5000" w:type="pct"/>
-        <w:tblBorders>
-          <w:top w:val="single" w:sz="4" w:space="0" w:color="BFBFBF"/>
-          <w:left w:val="single" w:sz="4" w:space="0" w:color="BFBFBF"/>
-          <w:bottom w:val="single" w:sz="4" w:space="0" w:color="BFBFBF"/>
-          <w:right w:val="single" w:sz="4" w:space="0" w:color="BFBFBF"/>
-          <w:insideH w:val="single" w:sz="4" w:space="0" w:color="BFBFBF"/>
-          <w:insideV w:val="single" w:sz="4" w:space="0" w:color="BFBFBF"/>
-        </w:tblBorders>
-        <w:tblLook w:val="04A0" w:firstRow="1" w:lastRow="0" w:firstColumn="1" w:lastColumn="0" w:noHBand="0" w:noVBand="1"/>
-      </w:tblPr>
-      <w:tblGrid>
-        <w:gridCol w:w="10800"/>
-      </w:tblGrid>
-      <w:tr>
-        <w:trPr>
-          <w:cantSplit/>
-        </w:trPr>
-        <w:tc>
-          <w:tcPr>
-            <w:tcW w:w="5000" w:type="pct"/>
-            <w:tcBorders>
-              <w:top w:val="single" w:sz="8" w:space="0" w:color="000000"/>
-              <w:left w:val="nil"/>
-              <w:bottom w:val="nil"/>
-              <w:right w:val="nil"/>
-            </w:tcBorders>
-          </w:tcPr>
-          <w:p>
-            <w:pPr>
-              <w:keepNext/>
-              <w:keepLines/>
-              <w:spacing w:after="0"/>
-              <w:rPr>
-                <w:sz w:val="16"/>
-                <w:szCs w:val="16"/>
-              </w:rPr>
-            </w:pPr>
-          </w:p>
-        </w:tc>
-      </w:tr>
-      <w:tr>
-        <w:trPr>
-          <w:cantSplit/>
-        </w:trPr>
-        <w:tc>
-          <w:tcPr>
-            <w:tcW w:w="5000" w:type="pct"/>
-            <w:tcBorders>
-              <w:top w:val="nil"/>
-              <w:left w:val="nil"/>
-              <w:bottom w:val="single" w:sz="8" w:space="0" w:color="000000"/>
-              <w:right w:val="nil"/>
-            </w:tcBorders>
-            <w:shd w:val="clear" w:color="auto" w:fill="D9D9D9" w:themeFill="background1" w:themeFillShade="D9"/>
-          </w:tcPr>
-          <w:p>
-            <w:pPr>
-              <w:keepNext/>
-              <w:keepLines/>
-              <w:spacing w:after="0"/>
-              <w:rPr>
-                <w:sz w:val="16"/>
-                <w:szCs w:val="16"/>
-              </w:rPr>
-            </w:pPr>
-          </w:p>
-        </w:tc>
-      </w:tr>
-      <w:tr>
-        <w:trPr>
-          <w:cantSplit/>
-        </w:trPr>
-        <w:tc>
-          <w:tcPr>
-            <w:tcW w:w="5000" w:type="pct"/>
-            <w:tcBorders>
-              <w:top w:val="single" w:sz="8" w:space="0" w:color="000000"/>
-              <w:left w:val="nil"/>
-              <w:bottom w:val="nil"/>
-              <w:right w:val="nil"/>
-            </w:tcBorders>
-          </w:tcPr>
-          <w:p>
-            <w:pPr>
-              <w:keepNext/>
-              <w:keepLines/>
-              <w:spacing w:after="0"/>
-              <w:rPr>
-                <w:sz w:val="16"/>
-                <w:szCs w:val="16"/>
-              </w:rPr>
-            </w:pPr>
-          </w:p>
-        </w:tc>
-      </w:tr>
-      <w:tr>
-        <w:trPr>
-          <w:cantSplit/>
-        </w:trPr>
-        <w:tc>
-          <w:tcPr>
-            <w:tcW w:w="5000" w:type="pct"/>
-            <w:tcBorders>
-              <w:top w:val="nil"/>
-              <w:left w:val="nil"/>
-              <w:bottom w:val="single" w:sz="8" w:space="0" w:color="000000"/>
-              <w:right w:val="nil"/>
-            </w:tcBorders>
-            <w:shd w:val="clear" w:color="auto" w:fill="D9D9D9" w:themeFill="background1" w:themeFillShade="D9"/>
-          </w:tcPr>
-          <w:p>
-            <w:pPr>
-              <w:keepNext/>
-              <w:keepLines/>
-              <w:spacing w:after="0"/>
-              <w:rPr>
-                <w:sz w:val="16"/>
-                <w:szCs w:val="16"/>
-              </w:rPr>
-            </w:pPr>
-          </w:p>
-        </w:tc>
-      </w:tr>
-      <w:tr>
-        <w:trPr>
-          <w:cantSplit/>
-        </w:trPr>
-        <w:tc>
-          <w:tcPr>
-            <w:tcW w:w="5000" w:type="pct"/>
-            <w:tcBorders>
-              <w:top w:val="single" w:sz="8" w:space="0" w:color="000000"/>
-              <w:left w:val="nil"/>
-              <w:bottom w:val="nil"/>
-              <w:right w:val="nil"/>
-            </w:tcBorders>
-          </w:tcPr>
-          <w:p>
-            <w:pPr>
-              <w:keepNext/>
-              <w:keepLines/>
-              <w:spacing w:after="0"/>
-              <w:rPr>
-                <w:sz w:val="16"/>
-                <w:szCs w:val="16"/>
-              </w:rPr>
-            </w:pPr>
-          </w:p>
-        </w:tc>
-      </w:tr>
-      <w:tr>
-        <w:trPr>
-          <w:cantSplit/>
-        </w:trPr>
-        <w:tc>
-          <w:tcPr>
-            <w:tcW w:w="5000" w:type="pct"/>
-            <w:tcBorders>
-              <w:top w:val="nil"/>
-              <w:left w:val="nil"/>
-              <w:bottom w:val="single" w:sz="8" w:space="0" w:color="000000"/>
-              <w:right w:val="nil"/>
-            </w:tcBorders>
-            <w:shd w:val="clear" w:color="auto" w:fill="D9D9D9" w:themeFill="background1" w:themeFillShade="D9"/>
-          </w:tcPr>
-          <w:p>
-            <w:pPr>
-              <w:keepNext/>
-              <w:keepLines/>
-              <w:spacing w:after="0"/>
-              <w:rPr>
-                <w:sz w:val="16"/>
-                <w:szCs w:val="16"/>
-              </w:rPr>
-            </w:pPr>
-          </w:p>
-        </w:tc>
-      </w:tr>
-      <w:tr>
-        <w:trPr>
-          <w:cantSplit/>
-        </w:trPr>
-        <w:tc>
-          <w:tcPr>
-            <w:tcW w:w="5000" w:type="pct"/>
-            <w:tcBorders>
-              <w:top w:val="single" w:sz="8" w:space="0" w:color="000000"/>
-              <w:left w:val="nil"/>
-              <w:bottom w:val="nil"/>
-              <w:right w:val="nil"/>
-            </w:tcBorders>
-          </w:tcPr>
-          <w:p>
-            <w:pPr>
-              <w:keepNext/>
-              <w:keepLines/>
-              <w:spacing w:after="0"/>
-              <w:rPr>
-                <w:sz w:val="16"/>
-                <w:szCs w:val="16"/>
-              </w:rPr>
-            </w:pPr>
-          </w:p>
-        </w:tc>
-      </w:tr>
-      <w:tr>
-        <w:trPr>
-          <w:cantSplit/>
-        </w:trPr>
-        <w:tc>
-          <w:tcPr>
-            <w:tcW w:w="5000" w:type="pct"/>
-            <w:tcBorders>
-              <w:top w:val="nil"/>
-              <w:left w:val="nil"/>
-              <w:bottom w:val="single" w:sz="8" w:space="0" w:color="000000"/>
-              <w:right w:val="nil"/>
-            </w:tcBorders>
-            <w:shd w:val="clear" w:color="auto" w:fill="D9D9D9" w:themeFill="background1" w:themeFillShade="D9"/>
-          </w:tcPr>
-          <w:p>
-            <w:pPr>
-              <w:keepNext w:val="0"/>
-              <w:keepLines/>
-              <w:spacing w:after="0"/>
-              <w:rPr>
-                <w:sz w:val="16"/>
-                <w:szCs w:val="16"/>
-              </w:rPr>
-            </w:pPr>
-          </w:p>
-        </w:tc>
-      </w:tr>
-    </w:tbl>
-    <w:p>
-      <w:pPr>
-        <w:keepNext/>
-        <w:keepLines/>
-        <w:spacing w:before="240"/>
-        <w:rPr>
-          <w:b/>
-        </w:rPr>
-      </w:pPr>
-      <w:r>
-        <w:rPr>
-          <w:b/>
-        </w:rPr>
-        <w:t>Why must horizontal and vertical movement be applied and resolved separately?</w:t>
-      </w:r>
-    </w:p>
-    <w:tbl>
-      <w:tblPr>
-        <w:tblW w:w="5000" w:type="pct"/>
-        <w:tblBorders>
-          <w:top w:val="single" w:sz="4" w:space="0" w:color="BFBFBF"/>
-          <w:left w:val="single" w:sz="4" w:space="0" w:color="BFBFBF"/>
-          <w:bottom w:val="single" w:sz="4" w:space="0" w:color="BFBFBF"/>
-          <w:right w:val="single" w:sz="4" w:space="0" w:color="BFBFBF"/>
-          <w:insideH w:val="single" w:sz="4" w:space="0" w:color="BFBFBF"/>
-          <w:insideV w:val="single" w:sz="4" w:space="0" w:color="BFBFBF"/>
-        </w:tblBorders>
-        <w:tblLook w:val="04A0" w:firstRow="1" w:lastRow="0" w:firstColumn="1" w:lastColumn="0" w:noHBand="0" w:noVBand="1"/>
-      </w:tblPr>
-      <w:tblGrid>
-        <w:gridCol w:w="10800"/>
-      </w:tblGrid>
-      <w:tr>
-        <w:trPr>
-          <w:cantSplit/>
-        </w:trPr>
-        <w:tc>
-          <w:tcPr>
-            <w:tcW w:w="5000" w:type="pct"/>
-            <w:tcBorders>
-              <w:top w:val="single" w:sz="8" w:space="0" w:color="000000"/>
-              <w:left w:val="nil"/>
-              <w:bottom w:val="nil"/>
-              <w:right w:val="nil"/>
-            </w:tcBorders>
-          </w:tcPr>
-          <w:p>
-            <w:pPr>
-              <w:keepNext/>
-              <w:keepLines/>
-              <w:spacing w:after="0"/>
-              <w:rPr>
-                <w:sz w:val="16"/>
-                <w:szCs w:val="16"/>
-              </w:rPr>
-            </w:pPr>
-          </w:p>
-        </w:tc>
-      </w:tr>
-      <w:tr>
-        <w:trPr>
-          <w:cantSplit/>
-        </w:trPr>
-        <w:tc>
-          <w:tcPr>
-            <w:tcW w:w="5000" w:type="pct"/>
-            <w:tcBorders>
-              <w:top w:val="nil"/>
-              <w:left w:val="nil"/>
-              <w:bottom w:val="single" w:sz="8" w:space="0" w:color="000000"/>
-              <w:right w:val="nil"/>
-            </w:tcBorders>
-            <w:shd w:val="clear" w:color="auto" w:fill="D9D9D9" w:themeFill="background1" w:themeFillShade="D9"/>
-          </w:tcPr>
-          <w:p>
-            <w:pPr>
-              <w:keepNext/>
-              <w:keepLines/>
-              <w:spacing w:after="0"/>
-              <w:rPr>
-                <w:sz w:val="16"/>
-                <w:szCs w:val="16"/>
-              </w:rPr>
-            </w:pPr>
-          </w:p>
-        </w:tc>
-      </w:tr>
-      <w:tr>
-        <w:trPr>
-          <w:cantSplit/>
-        </w:trPr>
-        <w:tc>
-          <w:tcPr>
-            <w:tcW w:w="5000" w:type="pct"/>
-            <w:tcBorders>
-              <w:top w:val="single" w:sz="8" w:space="0" w:color="000000"/>
-              <w:left w:val="nil"/>
-              <w:bottom w:val="nil"/>
-              <w:right w:val="nil"/>
-            </w:tcBorders>
-          </w:tcPr>
-          <w:p>
-            <w:pPr>
-              <w:keepNext/>
-              <w:keepLines/>
-              <w:spacing w:after="0"/>
-              <w:rPr>
-                <w:sz w:val="16"/>
-                <w:szCs w:val="16"/>
-              </w:rPr>
-            </w:pPr>
-          </w:p>
-        </w:tc>
-      </w:tr>
-      <w:tr>
-        <w:trPr>
-          <w:cantSplit/>
-        </w:trPr>
-        <w:tc>
-          <w:tcPr>
-            <w:tcW w:w="5000" w:type="pct"/>
-            <w:tcBorders>
-              <w:top w:val="nil"/>
-              <w:left w:val="nil"/>
-              <w:bottom w:val="single" w:sz="8" w:space="0" w:color="000000"/>
-              <w:right w:val="nil"/>
-            </w:tcBorders>
-            <w:shd w:val="clear" w:color="auto" w:fill="D9D9D9" w:themeFill="background1" w:themeFillShade="D9"/>
-          </w:tcPr>
-          <w:p>
-            <w:pPr>
-              <w:keepNext/>
-              <w:keepLines/>
-              <w:spacing w:after="0"/>
-              <w:rPr>
-                <w:sz w:val="16"/>
-                <w:szCs w:val="16"/>
-              </w:rPr>
-            </w:pPr>
-          </w:p>
-        </w:tc>
-      </w:tr>
-      <w:tr>
-        <w:trPr>
-          <w:cantSplit/>
-        </w:trPr>
-        <w:tc>
-          <w:tcPr>
-            <w:tcW w:w="5000" w:type="pct"/>
-            <w:tcBorders>
-              <w:top w:val="single" w:sz="8" w:space="0" w:color="000000"/>
-              <w:left w:val="nil"/>
-              <w:bottom w:val="nil"/>
-              <w:right w:val="nil"/>
-            </w:tcBorders>
-          </w:tcPr>
-          <w:p>
-            <w:pPr>
-              <w:keepNext/>
-              <w:keepLines/>
-              <w:spacing w:after="0"/>
-              <w:rPr>
-                <w:sz w:val="16"/>
-                <w:szCs w:val="16"/>
-              </w:rPr>
-            </w:pPr>
-          </w:p>
-        </w:tc>
-      </w:tr>
-      <w:tr>
-        <w:trPr>
-          <w:cantSplit/>
-        </w:trPr>
-        <w:tc>
-          <w:tcPr>
-            <w:tcW w:w="5000" w:type="pct"/>
-            <w:tcBorders>
-              <w:top w:val="nil"/>
-              <w:left w:val="nil"/>
-              <w:bottom w:val="single" w:sz="8" w:space="0" w:color="000000"/>
-              <w:right w:val="nil"/>
-            </w:tcBorders>
-            <w:shd w:val="clear" w:color="auto" w:fill="D9D9D9" w:themeFill="background1" w:themeFillShade="D9"/>
-          </w:tcPr>
-          <w:p>
-            <w:pPr>
-              <w:keepNext/>
-              <w:keepLines/>
-              <w:spacing w:after="0"/>
-              <w:rPr>
-                <w:sz w:val="16"/>
-                <w:szCs w:val="16"/>
-              </w:rPr>
-            </w:pPr>
-          </w:p>
-        </w:tc>
-      </w:tr>
-      <w:tr>
-        <w:trPr>
-          <w:cantSplit/>
-        </w:trPr>
-        <w:tc>
-          <w:tcPr>
-            <w:tcW w:w="5000" w:type="pct"/>
-            <w:tcBorders>
-              <w:top w:val="single" w:sz="8" w:space="0" w:color="000000"/>
-              <w:left w:val="nil"/>
-              <w:bottom w:val="nil"/>
-              <w:right w:val="nil"/>
-            </w:tcBorders>
-          </w:tcPr>
-          <w:p>
-            <w:pPr>
-              <w:keepNext/>
-              <w:keepLines/>
-              <w:spacing w:after="0"/>
-              <w:rPr>
-                <w:sz w:val="16"/>
-                <w:szCs w:val="16"/>
-              </w:rPr>
-            </w:pPr>
-          </w:p>
-        </w:tc>
-      </w:tr>
-      <w:tr>
-        <w:trPr>
-          <w:cantSplit/>
-        </w:trPr>
-        <w:tc>
-          <w:tcPr>
-            <w:tcW w:w="5000" w:type="pct"/>
-            <w:tcBorders>
-              <w:top w:val="nil"/>
-              <w:left w:val="nil"/>
-              <w:bottom w:val="single" w:sz="8" w:space="0" w:color="000000"/>
-              <w:right w:val="nil"/>
-            </w:tcBorders>
-            <w:shd w:val="clear" w:color="auto" w:fill="D9D9D9" w:themeFill="background1" w:themeFillShade="D9"/>
-          </w:tcPr>
-          <w:p>
-            <w:pPr>
-              <w:keepNext w:val="0"/>
-              <w:keepLines/>
-              <w:spacing w:after="0"/>
-              <w:rPr>
-                <w:sz w:val="16"/>
-                <w:szCs w:val="16"/>
-              </w:rPr>
-            </w:pPr>
-          </w:p>
-        </w:tc>
-      </w:tr>
-    </w:tbl>
-    <w:p>
-      <w:pPr>
-        <w:keepNext/>
-        <w:keepLines/>
-        <w:spacing w:before="240"/>
-        <w:rPr>
-          <w:b/>
-        </w:rPr>
-      </w:pPr>
-      <w:r>
-        <w:rPr>
-          <w:b/>
-        </w:rPr>
-        <w:t>How do the Wall class, inherited Player class, walls array, and setup-loop-end phases organize the project?</w:t>
-      </w:r>
-    </w:p>
-    <w:tbl>
-      <w:tblPr>
-        <w:tblW w:w="5000" w:type="pct"/>
-        <w:tblBorders>
-          <w:top w:val="single" w:sz="4" w:space="0" w:color="BFBFBF"/>
-          <w:left w:val="single" w:sz="4" w:space="0" w:color="BFBFBF"/>
-          <w:bottom w:val="single" w:sz="4" w:space="0" w:color="BFBFBF"/>
-          <w:right w:val="single" w:sz="4" w:space="0" w:color="BFBFBF"/>
-          <w:insideH w:val="single" w:sz="4" w:space="0" w:color="BFBFBF"/>
-          <w:insideV w:val="single" w:sz="4" w:space="0" w:color="BFBFBF"/>
-        </w:tblBorders>
-        <w:tblLook w:val="04A0" w:firstRow="1" w:lastRow="0" w:firstColumn="1" w:lastColumn="0" w:noHBand="0" w:noVBand="1"/>
-      </w:tblPr>
-      <w:tblGrid>
-        <w:gridCol w:w="10800"/>
-      </w:tblGrid>
-      <w:tr>
-        <w:trPr>
-          <w:cantSplit/>
-        </w:trPr>
-        <w:tc>
-          <w:tcPr>
-            <w:tcW w:w="5000" w:type="pct"/>
-            <w:tcBorders>
-              <w:top w:val="single" w:sz="8" w:space="0" w:color="000000"/>
-              <w:left w:val="nil"/>
-              <w:bottom w:val="nil"/>
-              <w:right w:val="nil"/>
-            </w:tcBorders>
-          </w:tcPr>
-          <w:p>
-            <w:pPr>
-              <w:keepNext/>
-              <w:keepLines/>
-              <w:spacing w:after="0"/>
-              <w:rPr>
-                <w:sz w:val="16"/>
-                <w:szCs w:val="16"/>
-              </w:rPr>
-            </w:pPr>
-          </w:p>
-        </w:tc>
-      </w:tr>
-      <w:tr>
-        <w:trPr>
-          <w:cantSplit/>
-        </w:trPr>
-        <w:tc>
-          <w:tcPr>
-            <w:tcW w:w="5000" w:type="pct"/>
-            <w:tcBorders>
-              <w:top w:val="nil"/>
-              <w:left w:val="nil"/>
-              <w:bottom w:val="single" w:sz="8" w:space="0" w:color="000000"/>
-              <w:right w:val="nil"/>
-            </w:tcBorders>
-            <w:shd w:val="clear" w:color="auto" w:fill="D9D9D9" w:themeFill="background1" w:themeFillShade="D9"/>
-          </w:tcPr>
-          <w:p>
-            <w:pPr>
-              <w:keepNext/>
-              <w:keepLines/>
-              <w:spacing w:after="0"/>
-              <w:rPr>
-                <w:sz w:val="16"/>
-                <w:szCs w:val="16"/>
-              </w:rPr>
-            </w:pPr>
-          </w:p>
-        </w:tc>
-      </w:tr>
-      <w:tr>
-        <w:trPr>
-          <w:cantSplit/>
-        </w:trPr>
-        <w:tc>
-          <w:tcPr>
-            <w:tcW w:w="5000" w:type="pct"/>
-            <w:tcBorders>
-              <w:top w:val="single" w:sz="8" w:space="0" w:color="000000"/>
-              <w:left w:val="nil"/>
-              <w:bottom w:val="nil"/>
-              <w:right w:val="nil"/>
-            </w:tcBorders>
-          </w:tcPr>
-          <w:p>
-            <w:pPr>
-              <w:keepNext/>
-              <w:keepLines/>
-              <w:spacing w:after="0"/>
-              <w:rPr>
-                <w:sz w:val="16"/>
-                <w:szCs w:val="16"/>
-              </w:rPr>
-            </w:pPr>
-          </w:p>
-        </w:tc>
-      </w:tr>
-      <w:tr>
-        <w:trPr>
-          <w:cantSplit/>
-        </w:trPr>
-        <w:tc>
-          <w:tcPr>
-            <w:tcW w:w="5000" w:type="pct"/>
-            <w:tcBorders>
-              <w:top w:val="nil"/>
-              <w:left w:val="nil"/>
-              <w:bottom w:val="single" w:sz="8" w:space="0" w:color="000000"/>
-              <w:right w:val="nil"/>
-            </w:tcBorders>
-            <w:shd w:val="clear" w:color="auto" w:fill="D9D9D9" w:themeFill="background1" w:themeFillShade="D9"/>
-          </w:tcPr>
-          <w:p>
-            <w:pPr>
-              <w:keepNext/>
-              <w:keepLines/>
-              <w:spacing w:after="0"/>
-              <w:rPr>
-                <w:sz w:val="16"/>
-                <w:szCs w:val="16"/>
-              </w:rPr>
-            </w:pPr>
-          </w:p>
-        </w:tc>
-      </w:tr>
-      <w:tr>
-        <w:trPr>
-          <w:cantSplit/>
-        </w:trPr>
-        <w:tc>
-          <w:tcPr>
-            <w:tcW w:w="5000" w:type="pct"/>
-            <w:tcBorders>
-              <w:top w:val="single" w:sz="8" w:space="0" w:color="000000"/>
-              <w:left w:val="nil"/>
-              <w:bottom w:val="nil"/>
-              <w:right w:val="nil"/>
-            </w:tcBorders>
-          </w:tcPr>
-          <w:p>
-            <w:pPr>
-              <w:keepNext/>
-              <w:keepLines/>
-              <w:spacing w:after="0"/>
-              <w:rPr>
-                <w:sz w:val="16"/>
-                <w:szCs w:val="16"/>
-              </w:rPr>
-            </w:pPr>
-          </w:p>
-        </w:tc>
-      </w:tr>
-      <w:tr>
-        <w:trPr>
-          <w:cantSplit/>
-        </w:trPr>
-        <w:tc>
-          <w:tcPr>
-            <w:tcW w:w="5000" w:type="pct"/>
-            <w:tcBorders>
-              <w:top w:val="nil"/>
-              <w:left w:val="nil"/>
-              <w:bottom w:val="single" w:sz="8" w:space="0" w:color="000000"/>
-              <w:right w:val="nil"/>
-            </w:tcBorders>
-            <w:shd w:val="clear" w:color="auto" w:fill="D9D9D9" w:themeFill="background1" w:themeFillShade="D9"/>
-          </w:tcPr>
-          <w:p>
-            <w:pPr>
-              <w:keepNext/>
-              <w:keepLines/>
-              <w:spacing w:after="0"/>
-              <w:rPr>
-                <w:sz w:val="16"/>
-                <w:szCs w:val="16"/>
-              </w:rPr>
-            </w:pPr>
-          </w:p>
-        </w:tc>
-      </w:tr>
-      <w:tr>
-        <w:trPr>
-          <w:cantSplit/>
-        </w:trPr>
-        <w:tc>
-          <w:tcPr>
-            <w:tcW w:w="5000" w:type="pct"/>
-            <w:tcBorders>
-              <w:top w:val="single" w:sz="8" w:space="0" w:color="000000"/>
-              <w:left w:val="nil"/>
-              <w:bottom w:val="nil"/>
-              <w:right w:val="nil"/>
-            </w:tcBorders>
-          </w:tcPr>
-          <w:p>
-            <w:pPr>
-              <w:keepNext/>
-              <w:keepLines/>
-              <w:spacing w:after="0"/>
-              <w:rPr>
-                <w:sz w:val="16"/>
-                <w:szCs w:val="16"/>
-              </w:rPr>
-            </w:pPr>
-          </w:p>
-        </w:tc>
-      </w:tr>
-      <w:tr>
-        <w:trPr>
-          <w:cantSplit/>
-        </w:trPr>
-        <w:tc>
-          <w:tcPr>
-            <w:tcW w:w="5000" w:type="pct"/>
-            <w:tcBorders>
-              <w:top w:val="nil"/>
-              <w:left w:val="nil"/>
-              <w:bottom w:val="single" w:sz="8" w:space="0" w:color="000000"/>
-              <w:right w:val="nil"/>
-            </w:tcBorders>
-            <w:shd w:val="clear" w:color="auto" w:fill="D9D9D9" w:themeFill="background1" w:themeFillShade="D9"/>
-          </w:tcPr>
-          <w:p>
-            <w:pPr>
-              <w:keepNext w:val="0"/>
-              <w:keepLines/>
-              <w:spacing w:after="0"/>
-              <w:rPr>
-                <w:sz w:val="16"/>
-                <w:szCs w:val="16"/>
-              </w:rPr>
-            </w:pPr>
-          </w:p>
-        </w:tc>
-      </w:tr>
-    </w:tbl>
+    <w:p/>
     <w:sectPr>
       <w:pgSz w:w="12240" w:h="15840"/>
       <w:pgMar w:top="720" w:right="720" w:bottom="720" w:left="720" w:header="720" w:footer="720" w:gutter="0"/>
@@ -4850,7 +2646,7 @@
 </file>
 
 <file path=word/styles.xml><?xml version="1.0" encoding="utf-8"?>
-<w:styles xmlns:mc="http://schemas.openxmlformats.org/markup-compatibility/2006" xmlns:r="http://schemas.openxmlformats.org/officeDocument/2006/relationships" xmlns:w="http://schemas.openxmlformats.org/wordprocessingml/2006/main" xmlns:w14="http://schemas.microsoft.com/office/word/2010/wordml" xmlns:w15="http://schemas.microsoft.com/office/word/2012/wordml" xmlns:w16cex="http://schemas.microsoft.com/office/word/2018/wordml/cex" xmlns:w16cid="http://schemas.microsoft.com/office/word/2016/wordml/cid" xmlns:w16="http://schemas.microsoft.com/office/word/2018/wordml" xmlns:w16sdtdh="http://schemas.microsoft.com/office/word/2020/wordml/sdtdatahash" xmlns:w16se="http://schemas.microsoft.com/office/word/2015/wordml/symex" mc:Ignorable="w14 w15 w16se w16cid w16 w16cex w16sdtdh">
+<w:styles xmlns:mc="http://schemas.openxmlformats.org/markup-compatibility/2006" xmlns:r="http://schemas.openxmlformats.org/officeDocument/2006/relationships" xmlns:w="http://schemas.openxmlformats.org/wordprocessingml/2006/main" xmlns:w14="http://schemas.microsoft.com/office/word/2010/wordml" xmlns:w15="http://schemas.microsoft.com/office/word/2012/wordml" xmlns:w16cid="http://schemas.microsoft.com/office/word/2016/wordml/cid" xmlns:w16se="http://schemas.microsoft.com/office/word/2015/wordml/symex" mc:Ignorable="w14 w15 w16se w16cid">
   <w:docDefaults>
     <w:rPrDefault>
       <w:rPr>
@@ -4866,7 +2662,7 @@
       </w:pPr>
     </w:pPrDefault>
   </w:docDefaults>
-  <w:latentStyles w:defLockedState="0" w:defUIPriority="99" w:defSemiHidden="0" w:defUnhideWhenUsed="0" w:defQFormat="0" w:count="376">
+  <w:latentStyles w:defLockedState="0" w:defUIPriority="99" w:defSemiHidden="0" w:defUnhideWhenUsed="0" w:defQFormat="0" w:count="375">
     <w:lsdException w:name="Normal" w:uiPriority="0" w:qFormat="1"/>
     <w:lsdException w:name="heading 1" w:uiPriority="9" w:qFormat="1"/>
     <w:lsdException w:name="heading 2" w:semiHidden="1" w:uiPriority="9" w:unhideWhenUsed="1" w:qFormat="1"/>
@@ -5242,7 +3038,6 @@
     <w:lsdException w:name="Smart Hyperlink" w:semiHidden="1" w:unhideWhenUsed="1"/>
     <w:lsdException w:name="Hashtag" w:semiHidden="1" w:unhideWhenUsed="1"/>
     <w:lsdException w:name="Unresolved Mention" w:semiHidden="1" w:unhideWhenUsed="1"/>
-    <w:lsdException w:name="Smart Link" w:semiHidden="1" w:unhideWhenUsed="1"/>
   </w:latentStyles>
   <w:style w:type="paragraph" w:default="1" w:styleId="Normal">
     <w:name w:val="Normal"/>

</xml_diff>